<commit_message>
Fold the combined run into the summary
Summary_of_runs.py now collects combined_Run as well, so the synthesis
covers all seven studies and 34 configurations. The combined
configuration enters the ranking second on the gap (+0.129, behind only
Run_04's labelled-sites subset at +0.226, which is computed against an
unusually low null) and first by a wide margin on the present-day gate
at 0.844.

The conclusions now name it as the corrected configuration against Run 0
as published, with the caveat that it changes five things at once, its
ingredients are not additive on the gap, and its ceiling has never been
tested against Run 0 in isolation.

Also moves a negative bar's label above its bar in the gate figure,
where it was colliding with the tick labels.

Co-Authored-By: Claude Opus 5 (1M context) <noreply@anthropic.com>
</commit_message>
<xml_diff>
--- a/Validation_M/National_biomass_library/Space_time_validation/New_proposal/Summary_of_runs.docx
+++ b/Validation_M/National_biomass_library/Space_time_validation/New_proposal/Summary_of_runs.docx
@@ -16,7 +16,7 @@
           <w:color w:val="52514E"/>
           <w:sz w:val="18"/>
         </w:rPr>
-        <w:t>Space_time_validation/New_proposal · generated 2026-09-23 · six studies, 31 configurations</w:t>
+        <w:t>Space_time_validation/New_proposal · generated 2026-09-23 · 7 studies, 34 configurations</w:t>
       </w:r>
     </w:p>
     <w:p>
@@ -45,7 +45,7 @@
         <w:pStyle w:val="Heading1"/>
       </w:pPr>
       <w:r>
-        <w:t>The six studies</w:t>
+        <w:t>The studies</w:t>
       </w:r>
     </w:p>
     <w:tbl>
@@ -345,6 +345,47 @@
                 <w:sz w:val="18"/>
               </w:rPr>
               <w:t>the rule is sound, the sample it unlocks is not</w:t>
+            </w:r>
+          </w:p>
+        </w:tc>
+      </w:tr>
+      <w:tr>
+        <w:tc>
+          <w:tcPr>
+            <w:tcW w:type="dxa" w:w="2304"/>
+          </w:tcPr>
+          <w:p>
+            <w:r>
+              <w:rPr>
+                <w:sz w:val="18"/>
+              </w:rPr>
+              <w:t>combined_Run</w:t>
+            </w:r>
+          </w:p>
+        </w:tc>
+        <w:tc>
+          <w:tcPr>
+            <w:tcW w:type="dxa" w:w="2880"/>
+          </w:tcPr>
+          <w:p>
+            <w:r>
+              <w:rPr>
+                <w:sz w:val="18"/>
+              </w:rPr>
+              <w:t>the five decisions those tests point to</w:t>
+            </w:r>
+          </w:p>
+        </w:tc>
+        <w:tc>
+          <w:tcPr>
+            <w:tcW w:type="dxa" w:w="3744"/>
+          </w:tcPr>
+          <w:p>
+            <w:r>
+              <w:rPr>
+                <w:sz w:val="18"/>
+              </w:rPr>
+              <w:t>the gate reaches 0.844 on 850 sites, 147 of them south of 37 S</w:t>
             </w:r>
           </w:p>
         </w:tc>
@@ -675,7 +716,7 @@
               <w:rPr>
                 <w:sz w:val="18"/>
               </w:rPr>
-              <w:t>Plot_area_floor_method</w:t>
+              <w:t>combined_Run</w:t>
             </w:r>
           </w:p>
         </w:tc>
@@ -688,7 +729,7 @@
               <w:rPr>
                 <w:sz w:val="18"/>
               </w:rPr>
-              <w:t>area_040</w:t>
+              <w:t>combined</w:t>
             </w:r>
           </w:p>
         </w:tc>
@@ -701,7 +742,7 @@
               <w:rPr>
                 <w:sz w:val="18"/>
               </w:rPr>
-              <w:t>584</w:t>
+              <w:t>850</w:t>
             </w:r>
           </w:p>
         </w:tc>
@@ -714,7 +755,7 @@
               <w:rPr>
                 <w:sz w:val="18"/>
               </w:rPr>
-              <w:t>1.275</w:t>
+              <w:t>0.356</w:t>
             </w:r>
           </w:p>
         </w:tc>
@@ -727,7 +768,7 @@
               <w:rPr>
                 <w:sz w:val="18"/>
               </w:rPr>
-              <w:t>0.351</w:t>
+              <w:t>0.602</w:t>
             </w:r>
           </w:p>
         </w:tc>
@@ -740,7 +781,7 @@
               <w:rPr>
                 <w:sz w:val="18"/>
               </w:rPr>
-              <w:t>0.223</w:t>
+              <w:t>0.473</w:t>
             </w:r>
           </w:p>
         </w:tc>
@@ -753,7 +794,7 @@
               <w:rPr>
                 <w:sz w:val="18"/>
               </w:rPr>
-              <w:t>+0.128</w:t>
+              <w:t>+0.129</w:t>
             </w:r>
           </w:p>
         </w:tc>
@@ -781,7 +822,7 @@
               <w:rPr>
                 <w:sz w:val="18"/>
               </w:rPr>
-              <w:t>area_030</w:t>
+              <w:t>area_040</w:t>
             </w:r>
           </w:p>
         </w:tc>
@@ -794,7 +835,7 @@
               <w:rPr>
                 <w:sz w:val="18"/>
               </w:rPr>
-              <w:t>607</w:t>
+              <w:t>584</w:t>
             </w:r>
           </w:p>
         </w:tc>
@@ -807,7 +848,7 @@
               <w:rPr>
                 <w:sz w:val="18"/>
               </w:rPr>
-              <w:t>1.274</w:t>
+              <w:t>1.275</w:t>
             </w:r>
           </w:p>
         </w:tc>
@@ -820,7 +861,7 @@
               <w:rPr>
                 <w:sz w:val="18"/>
               </w:rPr>
-              <w:t>0.338</w:t>
+              <w:t>0.351</w:t>
             </w:r>
           </w:p>
         </w:tc>
@@ -833,7 +874,7 @@
               <w:rPr>
                 <w:sz w:val="18"/>
               </w:rPr>
-              <w:t>0.230</w:t>
+              <w:t>0.223</w:t>
             </w:r>
           </w:p>
         </w:tc>
@@ -846,7 +887,7 @@
               <w:rPr>
                 <w:sz w:val="18"/>
               </w:rPr>
-              <w:t>+0.107</w:t>
+              <w:t>+0.128</w:t>
             </w:r>
           </w:p>
         </w:tc>
@@ -861,7 +902,7 @@
               <w:rPr>
                 <w:sz w:val="18"/>
               </w:rPr>
-              <w:t>Plot_area_floor_method</w:t>
+              <w:t>combined_Run</w:t>
             </w:r>
           </w:p>
         </w:tc>
@@ -874,7 +915,7 @@
               <w:rPr>
                 <w:sz w:val="18"/>
               </w:rPr>
-              <w:t>area_050</w:t>
+              <w:t>combined_no_ceiling</w:t>
             </w:r>
           </w:p>
         </w:tc>
@@ -887,7 +928,7 @@
               <w:rPr>
                 <w:sz w:val="18"/>
               </w:rPr>
-              <w:t>365</w:t>
+              <w:t>877</w:t>
             </w:r>
           </w:p>
         </w:tc>
@@ -900,7 +941,7 @@
               <w:rPr>
                 <w:sz w:val="18"/>
               </w:rPr>
-              <w:t>1.441</w:t>
+              <w:t>0.351</w:t>
             </w:r>
           </w:p>
         </w:tc>
@@ -913,7 +954,7 @@
               <w:rPr>
                 <w:sz w:val="18"/>
               </w:rPr>
-              <w:t>0.447</w:t>
+              <w:t>0.624</w:t>
             </w:r>
           </w:p>
         </w:tc>
@@ -926,7 +967,7 @@
               <w:rPr>
                 <w:sz w:val="18"/>
               </w:rPr>
-              <w:t>0.339</w:t>
+              <w:t>0.505</w:t>
             </w:r>
           </w:p>
         </w:tc>
@@ -939,7 +980,7 @@
               <w:rPr>
                 <w:sz w:val="18"/>
               </w:rPr>
-              <w:t>+0.107</w:t>
+              <w:t>+0.119</w:t>
             </w:r>
           </w:p>
         </w:tc>
@@ -954,7 +995,7 @@
               <w:rPr>
                 <w:sz w:val="18"/>
               </w:rPr>
-              <w:t>Run_0</w:t>
+              <w:t>Plot_area_floor_method</w:t>
             </w:r>
           </w:p>
         </w:tc>
@@ -967,7 +1008,7 @@
               <w:rPr>
                 <w:sz w:val="18"/>
               </w:rPr>
-              <w:t>run08_k5</w:t>
+              <w:t>area_030</w:t>
             </w:r>
           </w:p>
         </w:tc>
@@ -980,7 +1021,7 @@
               <w:rPr>
                 <w:sz w:val="18"/>
               </w:rPr>
-              <w:t>600</w:t>
+              <w:t>607</w:t>
             </w:r>
           </w:p>
         </w:tc>
@@ -993,7 +1034,7 @@
               <w:rPr>
                 <w:sz w:val="18"/>
               </w:rPr>
-              <w:t>0.409</w:t>
+              <w:t>1.274</w:t>
             </w:r>
           </w:p>
         </w:tc>
@@ -1006,7 +1047,7 @@
               <w:rPr>
                 <w:sz w:val="18"/>
               </w:rPr>
-              <w:t>0.308</w:t>
+              <w:t>0.338</w:t>
             </w:r>
           </w:p>
         </w:tc>
@@ -1019,7 +1060,7 @@
               <w:rPr>
                 <w:sz w:val="18"/>
               </w:rPr>
-              <w:t>0.205</w:t>
+              <w:t>0.230</w:t>
             </w:r>
           </w:p>
         </w:tc>
@@ -1032,7 +1073,7 @@
               <w:rPr>
                 <w:sz w:val="18"/>
               </w:rPr>
-              <w:t>+0.103</w:t>
+              <w:t>+0.107</w:t>
             </w:r>
           </w:p>
         </w:tc>
@@ -1047,7 +1088,7 @@
               <w:rPr>
                 <w:sz w:val="18"/>
               </w:rPr>
-              <w:t>Run_03</w:t>
+              <w:t>Plot_area_floor_method</w:t>
             </w:r>
           </w:p>
         </w:tc>
@@ -1060,7 +1101,7 @@
               <w:rPr>
                 <w:sz w:val="18"/>
               </w:rPr>
-              <w:t>rebuilt_b2p5</w:t>
+              <w:t>area_050</w:t>
             </w:r>
           </w:p>
         </w:tc>
@@ -1073,7 +1114,7 @@
               <w:rPr>
                 <w:sz w:val="18"/>
               </w:rPr>
-              <w:t>599</w:t>
+              <w:t>365</w:t>
             </w:r>
           </w:p>
         </w:tc>
@@ -1086,7 +1127,7 @@
               <w:rPr>
                 <w:sz w:val="18"/>
               </w:rPr>
-              <w:t>0.386</w:t>
+              <w:t>1.441</w:t>
             </w:r>
           </w:p>
         </w:tc>
@@ -1099,7 +1140,7 @@
               <w:rPr>
                 <w:sz w:val="18"/>
               </w:rPr>
-              <w:t>0.390</w:t>
+              <w:t>0.447</w:t>
             </w:r>
           </w:p>
         </w:tc>
@@ -1112,7 +1153,7 @@
               <w:rPr>
                 <w:sz w:val="18"/>
               </w:rPr>
-              <w:t>0.292</w:t>
+              <w:t>0.339</w:t>
             </w:r>
           </w:p>
         </w:tc>
@@ -1125,7 +1166,7 @@
               <w:rPr>
                 <w:sz w:val="18"/>
               </w:rPr>
-              <w:t>+0.098</w:t>
+              <w:t>+0.107</w:t>
             </w:r>
           </w:p>
         </w:tc>
@@ -1140,7 +1181,7 @@
               <w:rPr>
                 <w:sz w:val="18"/>
               </w:rPr>
-              <w:t>Run_03</w:t>
+              <w:t>Run_0</w:t>
             </w:r>
           </w:p>
         </w:tc>
@@ -1153,7 +1194,7 @@
               <w:rPr>
                 <w:sz w:val="18"/>
               </w:rPr>
-              <w:t>rebuilt_b2p3</w:t>
+              <w:t>run08_k5</w:t>
             </w:r>
           </w:p>
         </w:tc>
@@ -1166,7 +1207,7 @@
               <w:rPr>
                 <w:sz w:val="18"/>
               </w:rPr>
-              <w:t>599</w:t>
+              <w:t>600</w:t>
             </w:r>
           </w:p>
         </w:tc>
@@ -1179,7 +1220,7 @@
               <w:rPr>
                 <w:sz w:val="18"/>
               </w:rPr>
-              <w:t>0.403</w:t>
+              <w:t>0.409</w:t>
             </w:r>
           </w:p>
         </w:tc>
@@ -1192,7 +1233,7 @@
               <w:rPr>
                 <w:sz w:val="18"/>
               </w:rPr>
-              <w:t>0.392</w:t>
+              <w:t>0.308</w:t>
             </w:r>
           </w:p>
         </w:tc>
@@ -1205,7 +1246,7 @@
               <w:rPr>
                 <w:sz w:val="18"/>
               </w:rPr>
-              <w:t>0.295</w:t>
+              <w:t>0.205</w:t>
             </w:r>
           </w:p>
         </w:tc>
@@ -1218,7 +1259,7 @@
               <w:rPr>
                 <w:sz w:val="18"/>
               </w:rPr>
-              <w:t>+0.097</w:t>
+              <w:t>+0.103</w:t>
             </w:r>
           </w:p>
         </w:tc>
@@ -1246,7 +1287,7 @@
               <w:rPr>
                 <w:sz w:val="18"/>
               </w:rPr>
-              <w:t>rebuilt_b2p7</w:t>
+              <w:t>rebuilt_b2p5</w:t>
             </w:r>
           </w:p>
         </w:tc>
@@ -1259,7 +1300,7 @@
               <w:rPr>
                 <w:sz w:val="18"/>
               </w:rPr>
-              <w:t>598</w:t>
+              <w:t>599</w:t>
             </w:r>
           </w:p>
         </w:tc>
@@ -1272,7 +1313,7 @@
               <w:rPr>
                 <w:sz w:val="18"/>
               </w:rPr>
-              <w:t>0.373</w:t>
+              <w:t>0.386</w:t>
             </w:r>
           </w:p>
         </w:tc>
@@ -1285,7 +1326,7 @@
               <w:rPr>
                 <w:sz w:val="18"/>
               </w:rPr>
-              <w:t>0.391</w:t>
+              <w:t>0.390</w:t>
             </w:r>
           </w:p>
         </w:tc>
@@ -1298,7 +1339,7 @@
               <w:rPr>
                 <w:sz w:val="18"/>
               </w:rPr>
-              <w:t>0.298</w:t>
+              <w:t>0.292</w:t>
             </w:r>
           </w:p>
         </w:tc>
@@ -1311,7 +1352,7 @@
               <w:rPr>
                 <w:sz w:val="18"/>
               </w:rPr>
-              <w:t>+0.093</w:t>
+              <w:t>+0.098</w:t>
             </w:r>
           </w:p>
         </w:tc>
@@ -1326,7 +1367,7 @@
               <w:rPr>
                 <w:sz w:val="18"/>
               </w:rPr>
-              <w:t>Run_0</w:t>
+              <w:t>Run_03</w:t>
             </w:r>
           </w:p>
         </w:tc>
@@ -1339,7 +1380,7 @@
               <w:rPr>
                 <w:sz w:val="18"/>
               </w:rPr>
-              <w:t>run01_verified_only</w:t>
+              <w:t>rebuilt_b2p3</w:t>
             </w:r>
           </w:p>
         </w:tc>
@@ -1352,7 +1393,7 @@
               <w:rPr>
                 <w:sz w:val="18"/>
               </w:rPr>
-              <w:t>327</w:t>
+              <w:t>599</w:t>
             </w:r>
           </w:p>
         </w:tc>
@@ -1365,7 +1406,7 @@
               <w:rPr>
                 <w:sz w:val="18"/>
               </w:rPr>
-              <w:t>0.557</w:t>
+              <w:t>0.403</w:t>
             </w:r>
           </w:p>
         </w:tc>
@@ -1378,7 +1419,7 @@
               <w:rPr>
                 <w:sz w:val="18"/>
               </w:rPr>
-              <w:t>0.371</w:t>
+              <w:t>0.392</w:t>
             </w:r>
           </w:p>
         </w:tc>
@@ -1391,7 +1432,7 @@
               <w:rPr>
                 <w:sz w:val="18"/>
               </w:rPr>
-              <w:t>0.286</w:t>
+              <w:t>0.295</w:t>
             </w:r>
           </w:p>
         </w:tc>
@@ -1404,7 +1445,7 @@
               <w:rPr>
                 <w:sz w:val="18"/>
               </w:rPr>
-              <w:t>+0.084</w:t>
+              <w:t>+0.097</w:t>
             </w:r>
           </w:p>
         </w:tc>
@@ -1419,7 +1460,7 @@
               <w:rPr>
                 <w:sz w:val="18"/>
               </w:rPr>
-              <w:t>Run_01</w:t>
+              <w:t>Run_03</w:t>
             </w:r>
           </w:p>
         </w:tc>
@@ -1432,7 +1473,7 @@
               <w:rPr>
                 <w:sz w:val="18"/>
               </w:rPr>
-              <w:t>verified_only</w:t>
+              <w:t>rebuilt_b2p7</w:t>
             </w:r>
           </w:p>
         </w:tc>
@@ -1445,7 +1486,7 @@
               <w:rPr>
                 <w:sz w:val="18"/>
               </w:rPr>
-              <w:t>327</w:t>
+              <w:t>598</w:t>
             </w:r>
           </w:p>
         </w:tc>
@@ -1458,7 +1499,7 @@
               <w:rPr>
                 <w:sz w:val="18"/>
               </w:rPr>
-              <w:t>0.557</w:t>
+              <w:t>0.373</w:t>
             </w:r>
           </w:p>
         </w:tc>
@@ -1471,7 +1512,7 @@
               <w:rPr>
                 <w:sz w:val="18"/>
               </w:rPr>
-              <w:t>0.371</w:t>
+              <w:t>0.391</w:t>
             </w:r>
           </w:p>
         </w:tc>
@@ -1484,7 +1525,7 @@
               <w:rPr>
                 <w:sz w:val="18"/>
               </w:rPr>
-              <w:t>0.286</w:t>
+              <w:t>0.298</w:t>
             </w:r>
           </w:p>
         </w:tc>
@@ -1497,7 +1538,7 @@
               <w:rPr>
                 <w:sz w:val="18"/>
               </w:rPr>
-              <w:t>+0.084</w:t>
+              <w:t>+0.093</w:t>
             </w:r>
           </w:p>
         </w:tc>
@@ -1512,7 +1553,7 @@
               <w:rPr>
                 <w:sz w:val="18"/>
               </w:rPr>
-              <w:t>Run_02</w:t>
+              <w:t>Run_0</w:t>
             </w:r>
           </w:p>
         </w:tc>
@@ -1525,7 +1566,7 @@
               <w:rPr>
                 <w:sz w:val="18"/>
               </w:rPr>
-              <w:t>floor_004</w:t>
+              <w:t>run01_verified_only</w:t>
             </w:r>
           </w:p>
         </w:tc>
@@ -1538,7 +1579,7 @@
               <w:rPr>
                 <w:sz w:val="18"/>
               </w:rPr>
-              <w:t>778</w:t>
+              <w:t>327</w:t>
             </w:r>
           </w:p>
         </w:tc>
@@ -1551,7 +1592,7 @@
               <w:rPr>
                 <w:sz w:val="18"/>
               </w:rPr>
-              <w:t>0.515</w:t>
+              <w:t>0.557</w:t>
             </w:r>
           </w:p>
         </w:tc>
@@ -1564,7 +1605,7 @@
               <w:rPr>
                 <w:sz w:val="18"/>
               </w:rPr>
-              <w:t>0.309</w:t>
+              <w:t>0.371</w:t>
             </w:r>
           </w:p>
         </w:tc>
@@ -1577,7 +1618,7 @@
               <w:rPr>
                 <w:sz w:val="18"/>
               </w:rPr>
-              <w:t>0.225</w:t>
+              <w:t>0.286</w:t>
             </w:r>
           </w:p>
         </w:tc>
@@ -1605,7 +1646,7 @@
               <w:rPr>
                 <w:sz w:val="18"/>
               </w:rPr>
-              <w:t>Run_0</w:t>
+              <w:t>Run_01</w:t>
             </w:r>
           </w:p>
         </w:tc>
@@ -1618,7 +1659,7 @@
               <w:rPr>
                 <w:sz w:val="18"/>
               </w:rPr>
-              <w:t>run10_minclass_100</w:t>
+              <w:t>verified_only</w:t>
             </w:r>
           </w:p>
         </w:tc>
@@ -1631,7 +1672,7 @@
               <w:rPr>
                 <w:sz w:val="18"/>
               </w:rPr>
-              <w:t>600</w:t>
+              <w:t>327</w:t>
             </w:r>
           </w:p>
         </w:tc>
@@ -1644,7 +1685,7 @@
               <w:rPr>
                 <w:sz w:val="18"/>
               </w:rPr>
-              <w:t>0.464</w:t>
+              <w:t>0.557</w:t>
             </w:r>
           </w:p>
         </w:tc>
@@ -1657,7 +1698,7 @@
               <w:rPr>
                 <w:sz w:val="18"/>
               </w:rPr>
-              <w:t>0.271</w:t>
+              <w:t>0.371</w:t>
             </w:r>
           </w:p>
         </w:tc>
@@ -1670,7 +1711,7 @@
               <w:rPr>
                 <w:sz w:val="18"/>
               </w:rPr>
-              <w:t>0.199</w:t>
+              <w:t>0.286</w:t>
             </w:r>
           </w:p>
         </w:tc>
@@ -1683,7 +1724,7 @@
               <w:rPr>
                 <w:sz w:val="18"/>
               </w:rPr>
-              <w:t>+0.072</w:t>
+              <w:t>+0.084</w:t>
             </w:r>
           </w:p>
         </w:tc>
@@ -1698,7 +1739,7 @@
               <w:rPr>
                 <w:sz w:val="18"/>
               </w:rPr>
-              <w:t>Run_0</w:t>
+              <w:t>Run_02</w:t>
             </w:r>
           </w:p>
         </w:tc>
@@ -1711,7 +1752,7 @@
               <w:rPr>
                 <w:sz w:val="18"/>
               </w:rPr>
-              <w:t>run06_variance_99</w:t>
+              <w:t>floor_004</w:t>
             </w:r>
           </w:p>
         </w:tc>
@@ -1724,7 +1765,7 @@
               <w:rPr>
                 <w:sz w:val="18"/>
               </w:rPr>
-              <w:t>600</w:t>
+              <w:t>778</w:t>
             </w:r>
           </w:p>
         </w:tc>
@@ -1737,7 +1778,7 @@
               <w:rPr>
                 <w:sz w:val="18"/>
               </w:rPr>
-              <w:t>0.483</w:t>
+              <w:t>0.515</w:t>
             </w:r>
           </w:p>
         </w:tc>
@@ -1750,7 +1791,7 @@
               <w:rPr>
                 <w:sz w:val="18"/>
               </w:rPr>
-              <w:t>0.270</w:t>
+              <w:t>0.309</w:t>
             </w:r>
           </w:p>
         </w:tc>
@@ -1763,7 +1804,7 @@
               <w:rPr>
                 <w:sz w:val="18"/>
               </w:rPr>
-              <w:t>0.205</w:t>
+              <w:t>0.225</w:t>
             </w:r>
           </w:p>
         </w:tc>
@@ -1776,7 +1817,7 @@
               <w:rPr>
                 <w:sz w:val="18"/>
               </w:rPr>
-              <w:t>+0.065</w:t>
+              <w:t>+0.084</w:t>
             </w:r>
           </w:p>
         </w:tc>
@@ -1804,7 +1845,7 @@
               <w:rPr>
                 <w:sz w:val="18"/>
               </w:rPr>
-              <w:t>run03_mean_of_annual</w:t>
+              <w:t>run10_minclass_100</w:t>
             </w:r>
           </w:p>
         </w:tc>
@@ -1843,7 +1884,7 @@
               <w:rPr>
                 <w:sz w:val="18"/>
               </w:rPr>
-              <w:t>0.269</w:t>
+              <w:t>0.271</w:t>
             </w:r>
           </w:p>
         </w:tc>
@@ -1856,7 +1897,7 @@
               <w:rPr>
                 <w:sz w:val="18"/>
               </w:rPr>
-              <w:t>0.205</w:t>
+              <w:t>0.199</w:t>
             </w:r>
           </w:p>
         </w:tc>
@@ -1869,7 +1910,7 @@
               <w:rPr>
                 <w:sz w:val="18"/>
               </w:rPr>
-              <w:t>+0.064</w:t>
+              <w:t>+0.072</w:t>
             </w:r>
           </w:p>
         </w:tc>
@@ -1897,6 +1938,192 @@
               <w:rPr>
                 <w:sz w:val="18"/>
               </w:rPr>
+              <w:t>run06_variance_99</w:t>
+            </w:r>
+          </w:p>
+        </w:tc>
+        <w:tc>
+          <w:tcPr>
+            <w:tcW w:type="dxa" w:w="864"/>
+          </w:tcPr>
+          <w:p>
+            <w:r>
+              <w:rPr>
+                <w:sz w:val="18"/>
+              </w:rPr>
+              <w:t>600</w:t>
+            </w:r>
+          </w:p>
+        </w:tc>
+        <w:tc>
+          <w:tcPr>
+            <w:tcW w:type="dxa" w:w="1008"/>
+          </w:tcPr>
+          <w:p>
+            <w:r>
+              <w:rPr>
+                <w:sz w:val="18"/>
+              </w:rPr>
+              <w:t>0.483</w:t>
+            </w:r>
+          </w:p>
+        </w:tc>
+        <w:tc>
+          <w:tcPr>
+            <w:tcW w:type="dxa" w:w="1008"/>
+          </w:tcPr>
+          <w:p>
+            <w:r>
+              <w:rPr>
+                <w:sz w:val="18"/>
+              </w:rPr>
+              <w:t>0.270</w:t>
+            </w:r>
+          </w:p>
+        </w:tc>
+        <w:tc>
+          <w:tcPr>
+            <w:tcW w:type="dxa" w:w="1008"/>
+          </w:tcPr>
+          <w:p>
+            <w:r>
+              <w:rPr>
+                <w:sz w:val="18"/>
+              </w:rPr>
+              <w:t>0.205</w:t>
+            </w:r>
+          </w:p>
+        </w:tc>
+        <w:tc>
+          <w:tcPr>
+            <w:tcW w:type="dxa" w:w="1008"/>
+          </w:tcPr>
+          <w:p>
+            <w:r>
+              <w:rPr>
+                <w:sz w:val="18"/>
+              </w:rPr>
+              <w:t>+0.065</w:t>
+            </w:r>
+          </w:p>
+        </w:tc>
+      </w:tr>
+      <w:tr>
+        <w:tc>
+          <w:tcPr>
+            <w:tcW w:type="dxa" w:w="2016"/>
+          </w:tcPr>
+          <w:p>
+            <w:r>
+              <w:rPr>
+                <w:sz w:val="18"/>
+              </w:rPr>
+              <w:t>Run_0</w:t>
+            </w:r>
+          </w:p>
+        </w:tc>
+        <w:tc>
+          <w:tcPr>
+            <w:tcW w:type="dxa" w:w="2160"/>
+          </w:tcPr>
+          <w:p>
+            <w:r>
+              <w:rPr>
+                <w:sz w:val="18"/>
+              </w:rPr>
+              <w:t>run03_mean_of_annual</w:t>
+            </w:r>
+          </w:p>
+        </w:tc>
+        <w:tc>
+          <w:tcPr>
+            <w:tcW w:type="dxa" w:w="864"/>
+          </w:tcPr>
+          <w:p>
+            <w:r>
+              <w:rPr>
+                <w:sz w:val="18"/>
+              </w:rPr>
+              <w:t>600</w:t>
+            </w:r>
+          </w:p>
+        </w:tc>
+        <w:tc>
+          <w:tcPr>
+            <w:tcW w:type="dxa" w:w="1008"/>
+          </w:tcPr>
+          <w:p>
+            <w:r>
+              <w:rPr>
+                <w:sz w:val="18"/>
+              </w:rPr>
+              <w:t>0.464</w:t>
+            </w:r>
+          </w:p>
+        </w:tc>
+        <w:tc>
+          <w:tcPr>
+            <w:tcW w:type="dxa" w:w="1008"/>
+          </w:tcPr>
+          <w:p>
+            <w:r>
+              <w:rPr>
+                <w:sz w:val="18"/>
+              </w:rPr>
+              <w:t>0.269</w:t>
+            </w:r>
+          </w:p>
+        </w:tc>
+        <w:tc>
+          <w:tcPr>
+            <w:tcW w:type="dxa" w:w="1008"/>
+          </w:tcPr>
+          <w:p>
+            <w:r>
+              <w:rPr>
+                <w:sz w:val="18"/>
+              </w:rPr>
+              <w:t>0.205</w:t>
+            </w:r>
+          </w:p>
+        </w:tc>
+        <w:tc>
+          <w:tcPr>
+            <w:tcW w:type="dxa" w:w="1008"/>
+          </w:tcPr>
+          <w:p>
+            <w:r>
+              <w:rPr>
+                <w:sz w:val="18"/>
+              </w:rPr>
+              <w:t>+0.064</w:t>
+            </w:r>
+          </w:p>
+        </w:tc>
+      </w:tr>
+      <w:tr>
+        <w:tc>
+          <w:tcPr>
+            <w:tcW w:type="dxa" w:w="2016"/>
+          </w:tcPr>
+          <w:p>
+            <w:r>
+              <w:rPr>
+                <w:sz w:val="18"/>
+              </w:rPr>
+              <w:t>Run_0</w:t>
+            </w:r>
+          </w:p>
+        </w:tc>
+        <w:tc>
+          <w:tcPr>
+            <w:tcW w:type="dxa" w:w="2160"/>
+          </w:tcPr>
+          <w:p>
+            <w:r>
+              <w:rPr>
+                <w:sz w:val="18"/>
+              </w:rPr>
               <w:t>run00_baseline</w:t>
             </w:r>
           </w:p>
@@ -1963,6 +2190,99 @@
                 <w:sz w:val="18"/>
               </w:rPr>
               <w:t>+0.064</w:t>
+            </w:r>
+          </w:p>
+        </w:tc>
+      </w:tr>
+      <w:tr>
+        <w:tc>
+          <w:tcPr>
+            <w:tcW w:type="dxa" w:w="2016"/>
+          </w:tcPr>
+          <w:p>
+            <w:r>
+              <w:rPr>
+                <w:sz w:val="18"/>
+              </w:rPr>
+              <w:t>combined_Run</w:t>
+            </w:r>
+          </w:p>
+        </w:tc>
+        <w:tc>
+          <w:tcPr>
+            <w:tcW w:type="dxa" w:w="2160"/>
+          </w:tcPr>
+          <w:p>
+            <w:r>
+              <w:rPr>
+                <w:sz w:val="18"/>
+              </w:rPr>
+              <w:t>combined_no_area</w:t>
+            </w:r>
+          </w:p>
+        </w:tc>
+        <w:tc>
+          <w:tcPr>
+            <w:tcW w:type="dxa" w:w="864"/>
+          </w:tcPr>
+          <w:p>
+            <w:r>
+              <w:rPr>
+                <w:sz w:val="18"/>
+              </w:rPr>
+              <w:t>667</w:t>
+            </w:r>
+          </w:p>
+        </w:tc>
+        <w:tc>
+          <w:tcPr>
+            <w:tcW w:type="dxa" w:w="1008"/>
+          </w:tcPr>
+          <w:p>
+            <w:r>
+              <w:rPr>
+                <w:sz w:val="18"/>
+              </w:rPr>
+              <w:t>0.384</w:t>
+            </w:r>
+          </w:p>
+        </w:tc>
+        <w:tc>
+          <w:tcPr>
+            <w:tcW w:type="dxa" w:w="1008"/>
+          </w:tcPr>
+          <w:p>
+            <w:r>
+              <w:rPr>
+                <w:sz w:val="18"/>
+              </w:rPr>
+              <w:t>0.464</w:t>
+            </w:r>
+          </w:p>
+        </w:tc>
+        <w:tc>
+          <w:tcPr>
+            <w:tcW w:type="dxa" w:w="1008"/>
+          </w:tcPr>
+          <w:p>
+            <w:r>
+              <w:rPr>
+                <w:sz w:val="18"/>
+              </w:rPr>
+              <w:t>0.401</w:t>
+            </w:r>
+          </w:p>
+        </w:tc>
+        <w:tc>
+          <w:tcPr>
+            <w:tcW w:type="dxa" w:w="1008"/>
+          </w:tcPr>
+          <w:p>
+            <w:r>
+              <w:rPr>
+                <w:sz w:val="18"/>
+              </w:rPr>
+              <w:t>+0.063</w:t>
             </w:r>
           </w:p>
         </w:tc>
@@ -3384,7 +3704,7 @@
       <w:r>
         <w:drawing>
           <wp:inline xmlns:a="http://schemas.openxmlformats.org/drawingml/2006/main" xmlns:pic="http://schemas.openxmlformats.org/drawingml/2006/picture">
-            <wp:extent cx="5394960" cy="5052164"/>
+            <wp:extent cx="5394960" cy="5144664"/>
             <wp:docPr id="1" name="Picture 1"/>
             <wp:cNvGraphicFramePr>
               <a:graphicFrameLocks noChangeAspect="1"/>
@@ -3405,7 +3725,7 @@
                   <pic:spPr>
                     <a:xfrm>
                       <a:off x="0" y="0"/>
-                      <a:ext cx="5394960" cy="5052164"/>
+                      <a:ext cx="5394960" cy="5144664"/>
                     </a:xfrm>
                     <a:prstGeom prst="rect"/>
                   </pic:spPr>
@@ -3780,6 +4100,47 @@
                 <w:sz w:val="18"/>
               </w:rPr>
               <w:t>-0.023</w:t>
+            </w:r>
+          </w:p>
+        </w:tc>
+      </w:tr>
+      <w:tr>
+        <w:tc>
+          <w:tcPr>
+            <w:tcW w:type="dxa" w:w="4032"/>
+          </w:tcPr>
+          <w:p>
+            <w:r>
+              <w:rPr>
+                <w:sz w:val="18"/>
+              </w:rPr>
+              <w:t>the combined configuration</w:t>
+            </w:r>
+          </w:p>
+        </w:tc>
+        <w:tc>
+          <w:tcPr>
+            <w:tcW w:type="dxa" w:w="1440"/>
+          </w:tcPr>
+          <w:p>
+            <w:r>
+              <w:rPr>
+                <w:sz w:val="18"/>
+              </w:rPr>
+              <w:t>850</w:t>
+            </w:r>
+          </w:p>
+        </w:tc>
+        <w:tc>
+          <w:tcPr>
+            <w:tcW w:type="dxa" w:w="2304"/>
+          </w:tcPr>
+          <w:p>
+            <w:r>
+              <w:rPr>
+                <w:sz w:val="18"/>
+              </w:rPr>
+              <w:t>0.844</w:t>
             </w:r>
           </w:p>
         </w:tc>
@@ -3851,7 +4212,7 @@
         <w:pStyle w:val="Heading1"/>
       </w:pPr>
       <w:r>
-        <w:t>What runs through all six</w:t>
+        <w:t>What runs through all of them</w:t>
       </w:r>
     </w:p>
     <w:p>
@@ -3915,7 +4276,15 @@
         <w:pStyle w:val="ListBullet"/>
       </w:pPr>
       <w:r>
-        <w:t>Publish Run 0 as the configuration, and report Run_03 as the correction that matters. The rebuild changes the headline conclusion of the space-time validation: a substantial part of the present-day gate's failure was a property of the library's biomass column rather than of M'.</w:t>
+        <w:t>Report Run 0 as published and combined_Run as corrected. The difference between them is the headline of the whole exercise - the present-day gate goes from 0.418 to 0.844, on 850 sites rather than 600 and with 147 south of 37 S rather than 4 - and the correction that carries most of it is Run_03's rebuild of the observation.</w:t>
+      </w:r>
+    </w:p>
+    <w:p>
+      <w:pPr>
+        <w:pStyle w:val="ListBullet"/>
+      </w:pPr>
+      <w:r>
+        <w:t>Do not present the combined configuration as a one-change result. It changes five things at once, its ingredients are not additive on the gap, and its ceiling has never been tested against Run 0 in isolation. Point at the individual runs for the evidence.</w:t>
       </w:r>
     </w:p>
     <w:p>

</xml_diff>